<commit_message>
Rebuild from source with real python-docx (was hand-patched before)
python3 generate_templates.py && python3 assemble.py, now that Python is
installed. This replaces the previous commit's hand-patched build/*.docx
and suspect-docgen.html with the actual output of the source scripts, so
build/ now genuinely matches generate_templates.py/app_template.html
instead of being manually reconstructed. Verified the two fixes (line
breaks via <w:br/>, ปยส.115 checkbox tab-stop/split) are present in the
real build output.

Also picks up build/arrest_report_template.docx, a template the script
already generates but that isn't wired into assemble.py or the web app's
DOC_INFO yet.
</commit_message>
<xml_diff>
--- a/build/drug_test_115_template.docx
+++ b/build/drug_test_115_template.docx
@@ -119,10 +119,10 @@
     </w:p>
     <w:p>
       <w:pPr>
-        <w:spacing w:after="40" w:lineRule="auto" w:line="240"/>
         <w:tabs>
           <w:tab w:pos="5839" w:val="left"/>
         </w:tabs>
+        <w:spacing w:after="40" w:lineRule="auto" w:line="240"/>
       </w:pPr>
       <w:r>
         <w:rPr>
@@ -137,10 +137,10 @@
     </w:p>
     <w:p>
       <w:pPr>
-        <w:spacing w:after="40" w:lineRule="auto" w:line="240"/>
         <w:tabs>
           <w:tab w:pos="5839" w:val="left"/>
         </w:tabs>
+        <w:spacing w:after="40" w:lineRule="auto" w:line="240"/>
       </w:pPr>
       <w:r>
         <w:rPr>

</xml_diff>

<commit_message>
ปยส.115: add card issue/expiry date fields, expand section 1 heading
Compared the generated output against the station's actual reference
copy of the form. Three content gaps found and fixed in
generate_templates.py / app_template.html:

- Added "วันออกบัตร" / "วันหมดอายุ" (card issue/expiry date) fields —
  these were completely missing from our version. New web form inputs
  cardIssueDate/cardExpiryDate, new tags card_issue_date/card_expiry_date.
- Expanded the "ส่วนที่ 1" heading to include the full statutory
  reference clause, matching the reference form instead of the
  shortened version we had.
- "ได้สอบถาม" line now spells out "นาย/นาง/นางสาว" as blank options
  (matching the paper form) instead of auto-substituting the selected
  title.

Deliberately did not copy the reference file's inconsistent missing
tone marks/vowel signs (e.g. "ตองหา" instead of "ต้องหา") — those look
like typos in that particular copy, not intentional wording.
</commit_message>
<xml_diff>
--- a/build/drug_test_115_template.docx
+++ b/build/drug_test_115_template.docx
@@ -160,6 +160,27 @@
       <w:r>
         <w:rPr>
           <w:rFonts w:ascii="TH SarabunIT๙" w:hAnsi="TH SarabunIT๙" w:eastAsia="TH SarabunIT๙" w:cs="TH SarabunIT๙"/>
+          <w:b/>
+          <w:sz w:val="32"/>
+        </w:rPr>
+        <w:t>วันออกบัตร</w:t>
+      </w:r>
+      <w:r>
+        <w:rPr>
+          <w:rFonts w:ascii="TH SarabunIT๙" w:hAnsi="TH SarabunIT๙" w:eastAsia="TH SarabunIT๙" w:cs="TH SarabunIT๙"/>
+          <w:b w:val="0"/>
+          <w:sz w:val="32"/>
+        </w:rPr>
+        <w:t xml:space="preserve"> {card_issue_date}  วันหมดอายุ {card_expiry_date}</w:t>
+      </w:r>
+    </w:p>
+    <w:p>
+      <w:pPr>
+        <w:spacing w:after="40" w:lineRule="auto" w:line="240"/>
+      </w:pPr>
+      <w:r>
+        <w:rPr>
+          <w:rFonts w:ascii="TH SarabunIT๙" w:hAnsi="TH SarabunIT๙" w:eastAsia="TH SarabunIT๙" w:cs="TH SarabunIT๙"/>
           <w:b w:val="0"/>
           <w:sz w:val="32"/>
         </w:rPr>
@@ -176,7 +197,7 @@
           <w:b w:val="0"/>
           <w:sz w:val="32"/>
         </w:rPr>
-        <w:t>ได้สอบถาม {suspect_title}{suspect_full_name} อายุ {suspect_age} ปี</w:t>
+        <w:t>ได้สอบถาม นาย/นาง/นางสาว {suspect_full_name} อายุ {suspect_age} ปี</w:t>
       </w:r>
     </w:p>
     <w:p>
@@ -256,13 +277,24 @@
       </w:r>
     </w:p>
     <w:p>
+      <w:pPr>
+        <w:spacing w:after="40" w:lineRule="auto" w:line="240"/>
+      </w:pPr>
       <w:r>
         <w:rPr>
           <w:rFonts w:ascii="TH SarabunIT๙" w:hAnsi="TH SarabunIT๙" w:eastAsia="TH SarabunIT๙" w:cs="TH SarabunIT๙"/>
           <w:b/>
           <w:sz w:val="32"/>
         </w:rPr>
-        <w:t>ส่วนที่ 1 การตรวจหรือทดสอบสารเสพติดในร่างกาย</w:t>
+        <w:t xml:space="preserve">ส่วนที่ 1 การตรวจหรือทดสอบสารเสพติดในร่างกาย </w:t>
+      </w:r>
+      <w:r>
+        <w:rPr>
+          <w:rFonts w:ascii="TH SarabunIT๙" w:hAnsi="TH SarabunIT๙" w:eastAsia="TH SarabunIT๙" w:cs="TH SarabunIT๙"/>
+          <w:b w:val="0"/>
+          <w:sz w:val="32"/>
+        </w:rPr>
+        <w:t>โดยใช้อำนาจเจ้าพนักงาน ป.ป.ส. ตามประมวลกฎหมายยาเสพติด มาตรา ๑๑๕ เพื่อตรวจ/ทดสอบสารเสพติดในร่างกาย โดยใช้ชุดตรวจสารเสพติดในปัสสาวะ</w:t>
       </w:r>
     </w:p>
     <w:p>

</xml_diff>

<commit_message>
Revert ปยส.115 content changes, keep the checkbox/line-break fixes
User asked to go back to the original ปยส.115 wording (as first shipped)
and only keep the visual/branding additions (watermark, credit line).
Reverts the card issue/expiry date fields, the expanded ส่วนที่ 1 heading,
and the static "นาย/นาง/นางสาว" line from the previous commit — back to
auto-filled title and the shorter section heading. The checkbox tab-stop
fix and line-break fix from earlier commits are untouched.

Rebuilt via generate_templates.py + assemble.py (not a raw git revert of
the binary build/*.docx, to guarantee they're regenerated fresh and
consistent with the current app_template.html, which still has the
watermark/credit changes). Verified all 5 doc types generate cleanly.
</commit_message>
<xml_diff>
--- a/build/drug_test_115_template.docx
+++ b/build/drug_test_115_template.docx
@@ -160,27 +160,6 @@
       <w:r>
         <w:rPr>
           <w:rFonts w:ascii="TH SarabunIT๙" w:hAnsi="TH SarabunIT๙" w:eastAsia="TH SarabunIT๙" w:cs="TH SarabunIT๙"/>
-          <w:b/>
-          <w:sz w:val="32"/>
-        </w:rPr>
-        <w:t>วันออกบัตร</w:t>
-      </w:r>
-      <w:r>
-        <w:rPr>
-          <w:rFonts w:ascii="TH SarabunIT๙" w:hAnsi="TH SarabunIT๙" w:eastAsia="TH SarabunIT๙" w:cs="TH SarabunIT๙"/>
-          <w:b w:val="0"/>
-          <w:sz w:val="32"/>
-        </w:rPr>
-        <w:t xml:space="preserve"> {card_issue_date}  วันหมดอายุ {card_expiry_date}</w:t>
-      </w:r>
-    </w:p>
-    <w:p>
-      <w:pPr>
-        <w:spacing w:after="40" w:lineRule="auto" w:line="240"/>
-      </w:pPr>
-      <w:r>
-        <w:rPr>
-          <w:rFonts w:ascii="TH SarabunIT๙" w:hAnsi="TH SarabunIT๙" w:eastAsia="TH SarabunIT๙" w:cs="TH SarabunIT๙"/>
           <w:b w:val="0"/>
           <w:sz w:val="32"/>
         </w:rPr>
@@ -197,7 +176,7 @@
           <w:b w:val="0"/>
           <w:sz w:val="32"/>
         </w:rPr>
-        <w:t>ได้สอบถาม นาย/นาง/นางสาว {suspect_full_name} อายุ {suspect_age} ปี</w:t>
+        <w:t>ได้สอบถาม {suspect_title}{suspect_full_name} อายุ {suspect_age} ปี</w:t>
       </w:r>
     </w:p>
     <w:p>
@@ -277,24 +256,13 @@
       </w:r>
     </w:p>
     <w:p>
-      <w:pPr>
-        <w:spacing w:after="40" w:lineRule="auto" w:line="240"/>
-      </w:pPr>
       <w:r>
         <w:rPr>
           <w:rFonts w:ascii="TH SarabunIT๙" w:hAnsi="TH SarabunIT๙" w:eastAsia="TH SarabunIT๙" w:cs="TH SarabunIT๙"/>
           <w:b/>
           <w:sz w:val="32"/>
         </w:rPr>
-        <w:t xml:space="preserve">ส่วนที่ 1 การตรวจหรือทดสอบสารเสพติดในร่างกาย </w:t>
-      </w:r>
-      <w:r>
-        <w:rPr>
-          <w:rFonts w:ascii="TH SarabunIT๙" w:hAnsi="TH SarabunIT๙" w:eastAsia="TH SarabunIT๙" w:cs="TH SarabunIT๙"/>
-          <w:b w:val="0"/>
-          <w:sz w:val="32"/>
-        </w:rPr>
-        <w:t>โดยใช้อำนาจเจ้าพนักงาน ป.ป.ส. ตามประมวลกฎหมายยาเสพติด มาตรา ๑๑๕ เพื่อตรวจ/ทดสอบสารเสพติดในร่างกาย โดยใช้ชุดตรวจสารเสพติดในปัสสาวะ</w:t>
+        <w:t>ส่วนที่ 1 การตรวจหรือทดสอบสารเสพติดในร่างกาย</w:t>
       </w:r>
     </w:p>
     <w:p>

</xml_diff>